<commit_message>
Fix the phase-space generator's claims and regenerate the artifacts
The report said it measured rendering cost, but frame timing is limited
by the 120 Hz display. The KPI tiles showed one case beside a 36-run
count, and a linear histogram hid the 191 intervals of 30 ms or more.

- Purpose now says the benchmark tests whether the scene fits the frame
  budget.
- The dashboard note states the worst frame and age p95 across all runs.
- The histogram count axis is log-scaled; zero bins become gaps.
- The template's 68 unused shared strings are dropped; a test fails if
  they return.
- "Cases x repeats" states the recorded run count.
- Template paths are required; the tests read one from an environment
  variable instead of a path on the author's machine.
- The generator accepts run schema v1 and v2.
- Artifacts regenerated from the unchanged 36 runs; summary.json is
  byte-identical in content.

Co-Authored-By: Claude Opus 5.5 (1M context) <noreply@anthropic.com>
</commit_message>
<xml_diff>
--- a/docs/acceptance/phase-space-v1/artifacts/phase-space-experiment.docx
+++ b/docs/acceptance/phase-space-v1/artifacts/phase-space-experiment.docx
@@ -891,7 +891,7 @@
           <w:rFonts w:ascii="Georgia" w:cs="Georgia" w:eastAsia="Georgia" w:hAnsi="Georgia"/>
           <w:rtl w:val="0"/>
         </w:rPr>
-        <w:t xml:space="preserve">Measure the rendering cost of the full composition against trace-only rendering on identical deterministic input.</w:t>
+        <w:t xml:space="preserve">Measure whether the full composition fits the frame budget, against trace-only rendering on identical deterministic input. Frame timing is limited by display refresh, so it cannot resolve rendering cost below one refresh interval.</w:t>
       </w:r>
     </w:p>
     <w:p ns1:paraId="0000002C">
@@ -3284,7 +3284,7 @@
                 <w:szCs w:val="20"/>
                 <w:rtl w:val="0"/>
               </w:rPr>
-              <w:t xml:space="preserve">6 × 3 planned</w:t>
+              <w:t xml:space="preserve">6 × 3 planned; 18 runs</w:t>
             </w:r>
           </w:p>
         </w:tc>
@@ -3307,7 +3307,7 @@
                 <w:szCs w:val="20"/>
                 <w:rtl w:val="0"/>
               </w:rPr>
-              <w:t xml:space="preserve">6 × 3 planned</w:t>
+              <w:t xml:space="preserve">6 × 3 planned; 18 runs</w:t>
             </w:r>
           </w:p>
         </w:tc>

</xml_diff>